<commit_message>
Add provenance summary table to playbook
Resolves #2

Inserted a consolidated table between §6.3 and §6.4 that enumerates
Foundation-level and batch-manifest-level provenance attributes for
each enrichment type: axis alignment, Extension Code binding, logical
definition import, necessary conditions, subtree import (class
declarations and axioms separately), synonym enrichment, and Extension
Code stubs. A footnote references §6.10 for batch-level metadata that
applies to all types.

Co-Authored-By: Claude Opus 4.6 <noreply@anthropic.com>
</commit_message>
<xml_diff>
--- a/docs/Enriching_WHOFIC_with_Mondo.docx
+++ b/docs/Enriching_WHOFIC_with_Mondo.docx
@@ -5555,6 +5555,541 @@
       </w:pPr>
       <w:r>
         <w:t xml:space="preserve">The licensing fields on the Foundation side (dct:license, dct:rightsHolder, dct:source) are critical because Mondo is a license-aggregating ontology. Its own content is released under CC-BY-4.0, but many of the synonyms, xrefs, and definitions it aggregates originate from sources under more restrictive terms — SNOMED CT (SNOMED International Affiliate license), OMIM (no-redistribution terms for bulk data), ICD-10 (WHO terms), MeSH (public domain, U.S. NLM), NCIt (public domain), Orphanet (CC-BY-ND-4.0), DOID (CC0). A batch that harvests Mondo content into the Foundation and does not carry the per-item licensing forward is indistinguishable, to a downstream auditor, from a blanket re-license of everything as CC-BY. The staging QC suite therefore rejects any artifact missing a dct:license value, and the batch manifest includes a license-compatibility summary that identifies any source whose license is incompatible with the Foundation's intended redistribution terms. Items flagged as incompatible are either dropped from the batch, re-sourced from a compatibly-licensed alternative, or escalated to WHO legal review before submission.</w:t>
+      </w:r>
+    </w:p>
+    <w:p>
+      <w:pPr>
+        <w:spacing w:after="140" w:line="300"/>
+        <w:jc w:val="both"/>
+      </w:pPr>
+      <w:r>
+        <w:rPr>
+          <w:b/>
+          <w:bCs/>
+        </w:rPr>
+        <w:t xml:space="preserve">Provenance summary table.</w:t>
+      </w:r>
+      <w:r>
+        <w:t xml:space="preserve"> The following table enumerates the Foundation-level and batch-manifest-level provenance attributes for each enrichment type. Sections §6.4–§6.9 provide full descriptions of each attribute.</w:t>
+      </w:r>
+    </w:p>
+    <w:tbl>
+      <w:tblPr>
+        <w:tblW w:type="dxa" w:w="9360"/>
+        <w:tblBorders>
+          <w:top w:val="single" w:sz="4" w:color="999999"/>
+          <w:left w:val="single" w:sz="4" w:color="999999"/>
+          <w:bottom w:val="single" w:sz="4" w:color="999999"/>
+          <w:right w:val="single" w:sz="4" w:color="999999"/>
+          <w:insideH w:val="single" w:sz="4" w:color="999999"/>
+          <w:insideV w:val="single" w:sz="4" w:color="999999"/>
+        </w:tblBorders>
+      </w:tblPr>
+      <w:tblGrid>
+        <w:gridCol w:w="2200"/>
+        <w:gridCol w:w="3580"/>
+        <w:gridCol w:w="3580"/>
+      </w:tblGrid>
+      <w:tr>
+        <w:tc>
+          <w:tcPr>
+            <w:tcW w:type="dxa" w:w="2200"/>
+            <w:shd w:fill="D5E8F0" w:val="clear"/>
+          </w:tcPr>
+          <w:p>
+            <w:pPr>
+              <w:spacing w:after="40" w:before="40"/>
+            </w:pPr>
+            <w:r>
+              <w:rPr>
+                <w:b/>
+                <w:bCs/>
+                <w:sz w:val="18"/>
+                <w:szCs w:val="18"/>
+              </w:rPr>
+              <w:t>Enrichment Type</w:t>
+            </w:r>
+          </w:p>
+        </w:tc>
+        <w:tc>
+          <w:tcPr>
+            <w:tcW w:type="dxa" w:w="3580"/>
+            <w:shd w:fill="D5E8F0" w:val="clear"/>
+          </w:tcPr>
+          <w:p>
+            <w:pPr>
+              <w:spacing w:after="40" w:before="40"/>
+            </w:pPr>
+            <w:r>
+              <w:rPr>
+                <w:b/>
+                <w:bCs/>
+                <w:sz w:val="18"/>
+                <w:szCs w:val="18"/>
+              </w:rPr>
+              <w:t>Foundation-Level Attributes</w:t>
+            </w:r>
+          </w:p>
+        </w:tc>
+        <w:tc>
+          <w:tcPr>
+            <w:tcW w:type="dxa" w:w="3580"/>
+            <w:shd w:fill="D5E8F0" w:val="clear"/>
+          </w:tcPr>
+          <w:p>
+            <w:pPr>
+              <w:spacing w:after="40" w:before="40"/>
+            </w:pPr>
+            <w:r>
+              <w:rPr>
+                <w:b/>
+                <w:bCs/>
+                <w:sz w:val="18"/>
+                <w:szCs w:val="18"/>
+              </w:rPr>
+              <w:t>Batch Manifest Attributes</w:t>
+            </w:r>
+          </w:p>
+        </w:tc>
+      </w:tr>
+      <w:tr>
+        <w:tc>
+          <w:tcPr>
+            <w:tcW w:type="dxa" w:w="2200"/>
+          </w:tcPr>
+          <w:p>
+            <w:pPr>
+              <w:spacing w:after="40" w:before="40"/>
+            </w:pPr>
+            <w:r>
+              <w:rPr>
+                <w:sz w:val="18"/>
+                <w:szCs w:val="18"/>
+              </w:rPr>
+              <w:t>Axis-to-relation alignment (§3.1)</w:t>
+            </w:r>
+          </w:p>
+        </w:tc>
+        <w:tc>
+          <w:tcPr>
+            <w:tcW w:type="dxa" w:w="3580"/>
+          </w:tcPr>
+          <w:p>
+            <w:pPr>
+              <w:spacing w:after="40" w:before="40"/>
+            </w:pPr>
+            <w:r>
+              <w:rPr>
+                <w:sz w:val="18"/>
+                <w:szCs w:val="18"/>
+              </w:rPr>
+              <w:t>prov:wasDerivedFrom, dct:license, dct:rightsHolder, icd:batchId</w:t>
+            </w:r>
+          </w:p>
+        </w:tc>
+        <w:tc>
+          <w:tcPr>
+            <w:tcW w:type="dxa" w:w="3580"/>
+          </w:tcPr>
+          <w:p>
+            <w:pPr>
+              <w:spacing w:after="40" w:before="40"/>
+            </w:pPr>
+            <w:r>
+              <w:rPr>
+                <w:sz w:val="18"/>
+                <w:szCs w:val="18"/>
+              </w:rPr>
+              <w:t>icd:generatedByPattern, icd:mappingJustification, rdfs:comment</w:t>
+            </w:r>
+          </w:p>
+        </w:tc>
+      </w:tr>
+      <w:tr>
+        <w:tc>
+          <w:tcPr>
+            <w:tcW w:type="dxa" w:w="2200"/>
+          </w:tcPr>
+          <w:p>
+            <w:pPr>
+              <w:spacing w:after="40" w:before="40"/>
+            </w:pPr>
+            <w:r>
+              <w:rPr>
+                <w:sz w:val="18"/>
+                <w:szCs w:val="18"/>
+              </w:rPr>
+              <w:t>Extension Code binding (§3.5)</w:t>
+            </w:r>
+          </w:p>
+        </w:tc>
+        <w:tc>
+          <w:tcPr>
+            <w:tcW w:type="dxa" w:w="3580"/>
+          </w:tcPr>
+          <w:p>
+            <w:pPr>
+              <w:spacing w:after="40" w:before="40"/>
+            </w:pPr>
+            <w:r>
+              <w:rPr>
+                <w:sz w:val="18"/>
+                <w:szCs w:val="18"/>
+              </w:rPr>
+              <w:t>prov:wasDerivedFrom, oboInOwl:hasDbXref, dct:license, dct:rightsHolder, icd:batchId</w:t>
+            </w:r>
+          </w:p>
+        </w:tc>
+        <w:tc>
+          <w:tcPr>
+            <w:tcW w:type="dxa" w:w="3580"/>
+          </w:tcPr>
+          <w:p>
+            <w:pPr>
+              <w:spacing w:after="40" w:before="40"/>
+            </w:pPr>
+            <w:r>
+              <w:rPr>
+                <w:sz w:val="18"/>
+                <w:szCs w:val="18"/>
+              </w:rPr>
+              <w:t>icd:generatedByPattern, icd:mappingJustification, rdfs:seeAlso</w:t>
+            </w:r>
+          </w:p>
+        </w:tc>
+      </w:tr>
+      <w:tr>
+        <w:tc>
+          <w:tcPr>
+            <w:tcW w:type="dxa" w:w="2200"/>
+          </w:tcPr>
+          <w:p>
+            <w:pPr>
+              <w:spacing w:after="40" w:before="40"/>
+            </w:pPr>
+            <w:r>
+              <w:rPr>
+                <w:sz w:val="18"/>
+                <w:szCs w:val="18"/>
+              </w:rPr>
+              <w:t>Logical definition import (§3.2)</w:t>
+            </w:r>
+          </w:p>
+        </w:tc>
+        <w:tc>
+          <w:tcPr>
+            <w:tcW w:type="dxa" w:w="3580"/>
+          </w:tcPr>
+          <w:p>
+            <w:pPr>
+              <w:spacing w:after="40" w:before="40"/>
+            </w:pPr>
+            <w:r>
+              <w:rPr>
+                <w:sz w:val="18"/>
+                <w:szCs w:val="18"/>
+              </w:rPr>
+              <w:t>prov:wasDerivedFrom, oboInOwl:hasDbXref, dct:license, dct:rightsHolder, icd:batchId</w:t>
+            </w:r>
+          </w:p>
+        </w:tc>
+        <w:tc>
+          <w:tcPr>
+            <w:tcW w:type="dxa" w:w="3580"/>
+          </w:tcPr>
+          <w:p>
+            <w:pPr>
+              <w:spacing w:after="40" w:before="40"/>
+            </w:pPr>
+            <w:r>
+              <w:rPr>
+                <w:sz w:val="18"/>
+                <w:szCs w:val="18"/>
+              </w:rPr>
+              <w:t>icd:generatedByPattern, icd:patternVersion, icd:reviewDecision, prov:generatedAtTime</w:t>
+            </w:r>
+          </w:p>
+        </w:tc>
+      </w:tr>
+      <w:tr>
+        <w:tc>
+          <w:tcPr>
+            <w:tcW w:type="dxa" w:w="2200"/>
+          </w:tcPr>
+          <w:p>
+            <w:pPr>
+              <w:spacing w:after="40" w:before="40"/>
+            </w:pPr>
+            <w:r>
+              <w:rPr>
+                <w:sz w:val="18"/>
+                <w:szCs w:val="18"/>
+              </w:rPr>
+              <w:t>Necessary conditions (§3.3)</w:t>
+            </w:r>
+          </w:p>
+        </w:tc>
+        <w:tc>
+          <w:tcPr>
+            <w:tcW w:type="dxa" w:w="3580"/>
+          </w:tcPr>
+          <w:p>
+            <w:pPr>
+              <w:spacing w:after="40" w:before="40"/>
+            </w:pPr>
+            <w:r>
+              <w:rPr>
+                <w:sz w:val="18"/>
+                <w:szCs w:val="18"/>
+              </w:rPr>
+              <w:t>prov:wasDerivedFrom, oboInOwl:hasDbXref, dct:license, dct:rightsHolder, icd:batchId</w:t>
+            </w:r>
+          </w:p>
+        </w:tc>
+        <w:tc>
+          <w:tcPr>
+            <w:tcW w:type="dxa" w:w="3580"/>
+          </w:tcPr>
+          <w:p>
+            <w:pPr>
+              <w:spacing w:after="40" w:before="40"/>
+            </w:pPr>
+            <w:r>
+              <w:rPr>
+                <w:sz w:val="18"/>
+                <w:szCs w:val="18"/>
+              </w:rPr>
+              <w:t>icd:generatedByPattern, icd:patternVersion, icd:mappingJustification, prov:generatedAtTime</w:t>
+            </w:r>
+          </w:p>
+        </w:tc>
+      </w:tr>
+      <w:tr>
+        <w:tc>
+          <w:tcPr>
+            <w:tcW w:type="dxa" w:w="2200"/>
+          </w:tcPr>
+          <w:p>
+            <w:pPr>
+              <w:spacing w:after="40" w:before="40"/>
+            </w:pPr>
+            <w:r>
+              <w:rPr>
+                <w:sz w:val="18"/>
+                <w:szCs w:val="18"/>
+              </w:rPr>
+              <w:t>Subtree import (§3.4) — class declarations</w:t>
+            </w:r>
+          </w:p>
+        </w:tc>
+        <w:tc>
+          <w:tcPr>
+            <w:tcW w:type="dxa" w:w="3580"/>
+          </w:tcPr>
+          <w:p>
+            <w:pPr>
+              <w:spacing w:after="40" w:before="40"/>
+            </w:pPr>
+            <w:r>
+              <w:rPr>
+                <w:sz w:val="18"/>
+                <w:szCs w:val="18"/>
+              </w:rPr>
+              <w:t>prov:wasDerivedFrom, dct:source, dct:license, dct:rightsHolder, icd:batchId</w:t>
+            </w:r>
+          </w:p>
+        </w:tc>
+        <w:tc>
+          <w:tcPr>
+            <w:tcW w:type="dxa" w:w="3580"/>
+          </w:tcPr>
+          <w:p>
+            <w:pPr>
+              <w:spacing w:after="40" w:before="40"/>
+            </w:pPr>
+            <w:r>
+              <w:rPr>
+                <w:sz w:val="18"/>
+                <w:szCs w:val="18"/>
+              </w:rPr>
+              <w:t>icd:generatedByPattern, icd:patternVersion, prov:generatedAtTime, prov:wasAttributedTo, icd:anchorFoundationClass, icd:anchorMondoClass, icd:anchorJustification, icd:provisionalIri, icd:parentWalkPath, icd:taxonConstraintChecked, icd:reviewDecision</w:t>
+            </w:r>
+          </w:p>
+        </w:tc>
+      </w:tr>
+      <w:tr>
+        <w:tc>
+          <w:tcPr>
+            <w:tcW w:type="dxa" w:w="2200"/>
+          </w:tcPr>
+          <w:p>
+            <w:pPr>
+              <w:spacing w:after="40" w:before="40"/>
+            </w:pPr>
+            <w:r>
+              <w:rPr>
+                <w:sz w:val="18"/>
+                <w:szCs w:val="18"/>
+              </w:rPr>
+              <w:t>Subtree import (§3.4) — SubClassOf / EquivalentClasses axioms</w:t>
+            </w:r>
+          </w:p>
+        </w:tc>
+        <w:tc>
+          <w:tcPr>
+            <w:tcW w:type="dxa" w:w="3580"/>
+          </w:tcPr>
+          <w:p>
+            <w:pPr>
+              <w:spacing w:after="40" w:before="40"/>
+            </w:pPr>
+            <w:r>
+              <w:rPr>
+                <w:sz w:val="18"/>
+                <w:szCs w:val="18"/>
+              </w:rPr>
+              <w:t>prov:wasDerivedFrom, dct:source, dct:license, dct:rightsHolder, icd:batchId, icd:batchManifestHash</w:t>
+            </w:r>
+          </w:p>
+        </w:tc>
+        <w:tc>
+          <w:tcPr>
+            <w:tcW w:type="dxa" w:w="3580"/>
+          </w:tcPr>
+          <w:p>
+            <w:pPr>
+              <w:spacing w:after="40" w:before="40"/>
+            </w:pPr>
+            <w:r>
+              <w:rPr>
+                <w:sz w:val="18"/>
+                <w:szCs w:val="18"/>
+              </w:rPr>
+              <w:t>(same as class declarations row above)</w:t>
+            </w:r>
+          </w:p>
+        </w:tc>
+      </w:tr>
+      <w:tr>
+        <w:tc>
+          <w:tcPr>
+            <w:tcW w:type="dxa" w:w="2200"/>
+          </w:tcPr>
+          <w:p>
+            <w:pPr>
+              <w:spacing w:after="40" w:before="40"/>
+            </w:pPr>
+            <w:r>
+              <w:rPr>
+                <w:sz w:val="18"/>
+                <w:szCs w:val="18"/>
+              </w:rPr>
+              <w:t>Synonym enrichment (§3.10)</w:t>
+            </w:r>
+          </w:p>
+        </w:tc>
+        <w:tc>
+          <w:tcPr>
+            <w:tcW w:type="dxa" w:w="3580"/>
+          </w:tcPr>
+          <w:p>
+            <w:pPr>
+              <w:spacing w:after="40" w:before="40"/>
+            </w:pPr>
+            <w:r>
+              <w:rPr>
+                <w:sz w:val="18"/>
+                <w:szCs w:val="18"/>
+              </w:rPr>
+              <w:t>prov:wasDerivedFrom, oboInOwl:hasDbXref, icd:sourceSynonymScope, dct:license, dct:rightsHolder, dct:source, icd:batchId</w:t>
+            </w:r>
+          </w:p>
+        </w:tc>
+        <w:tc>
+          <w:tcPr>
+            <w:tcW w:type="dxa" w:w="3580"/>
+          </w:tcPr>
+          <w:p>
+            <w:pPr>
+              <w:spacing w:after="40" w:before="40"/>
+            </w:pPr>
+            <w:r>
+              <w:rPr>
+                <w:sz w:val="18"/>
+                <w:szCs w:val="18"/>
+              </w:rPr>
+              <w:t>icd:generatedByPattern, icd:termLanguage, icd:stoplistVersion, icd:reviewDecision</w:t>
+            </w:r>
+          </w:p>
+        </w:tc>
+      </w:tr>
+      <w:tr>
+        <w:tc>
+          <w:tcPr>
+            <w:tcW w:type="dxa" w:w="2200"/>
+          </w:tcPr>
+          <w:p>
+            <w:pPr>
+              <w:spacing w:after="40" w:before="40"/>
+            </w:pPr>
+            <w:r>
+              <w:rPr>
+                <w:sz w:val="18"/>
+                <w:szCs w:val="18"/>
+              </w:rPr>
+              <w:t>Extension Code stubs (§3.5/§3.8)</w:t>
+            </w:r>
+          </w:p>
+        </w:tc>
+        <w:tc>
+          <w:tcPr>
+            <w:tcW w:type="dxa" w:w="3580"/>
+          </w:tcPr>
+          <w:p>
+            <w:pPr>
+              <w:spacing w:after="40" w:before="40"/>
+            </w:pPr>
+            <w:r>
+              <w:rPr>
+                <w:sz w:val="18"/>
+                <w:szCs w:val="18"/>
+              </w:rPr>
+              <w:t>prov:wasDerivedFrom, dct:license, dct:rightsHolder, dct:source, icd:batchId</w:t>
+            </w:r>
+          </w:p>
+        </w:tc>
+        <w:tc>
+          <w:tcPr>
+            <w:tcW w:type="dxa" w:w="3580"/>
+          </w:tcPr>
+          <w:p>
+            <w:pPr>
+              <w:spacing w:after="40" w:before="40"/>
+            </w:pPr>
+            <w:r>
+              <w:rPr>
+                <w:sz w:val="18"/>
+                <w:szCs w:val="18"/>
+              </w:rPr>
+              <w:t>icd:generatedByPattern, icd:patternVersion, prov:generatedAtTime, prov:wasAttributedTo</w:t>
+            </w:r>
+          </w:p>
+        </w:tc>
+      </w:tr>
+    </w:tbl>
+    <w:p>
+      <w:pPr>
+        <w:spacing w:after="140" w:line="300"/>
+        <w:jc w:val="both"/>
+      </w:pPr>
+      <w:r>
+        <w:rPr>
+          <w:i/>
+          <w:iCs/>
+          <w:sz w:val="20"/>
+          <w:szCs w:val="20"/>
+        </w:rPr>
+        <w:t xml:space="preserve">Note: all batch manifest entries also carry the batch-level metadata described in §6.10 (Foundation release hash, Mondo release hash, QC report, license-compatibility summary, icd:batchManifestHash).</w:t>
       </w:r>
     </w:p>
     <w:p>

</xml_diff>